<commit_message>
Update portfolio link in resume
</commit_message>
<xml_diff>
--- a/static/resume.docx
+++ b/static/resume.docx
@@ -74,14 +74,10 @@
             <w:rStyle w:val="Hyperlink"/>
             <w:sz w:val="20"/>
           </w:rPr>
-          <w:t>oberai.dev</w:t>
+          <w:t>adityaoberai.com</w:t>
         </w:r>
       </w:hyperlink>
       <w:r>
-        <w:rPr>
-          <w:rStyle w:val="Hyperlink"/>
-          <w:sz w:val="20"/>
-        </w:rPr>
         <w:t xml:space="preserve"> </w:t>
       </w:r>
       <w:r>

</xml_diff>